<commit_message>
add week report template
</commit_message>
<xml_diff>
--- a/planning/templates/Mau_bao_cao_tuan_GVHD.docx
+++ b/planning/templates/Mau_bao_cao_tuan_GVHD.docx
@@ -12,26 +12,22 @@
     </w:p>
     <w:p>
       <w:r>
-        <w:t>Học viên: Nguyễn Hải Minh     |     GVHD: [Họ tên thầy hướng dẫn]</w:t>
+        <w:t>Học viên: Nguyễn Hải Minh | GVHD: [Họ tên thầy hướng dẫn]</w:t>
       </w:r>
     </w:p>
     <w:p>
       <w:r>
-        <w:t>Đề tài: RISC-V trên FPGA, định hướng custom instructions cho DSP/radar.</w:t>
+        <w:t>Hướng luận văn: baseline Ibex SoC trên FPGA; tuần này học nền tảng RV32I phục vụ đồng thời BTL Kiến trúc máy tính tiên tiến.</w:t>
       </w:r>
     </w:p>
     <w:p>
       <w:r>
-        <w:t>Tuần: [Số tuần]   |   Từ [dd/mm/yyyy] đến [dd/mm/yyyy]   |   Ngày gửi: [dd/mm/yyyy]</w:t>
+        <w:t>Tuần: [NN] | Từ [thứ Hai] đến [Chủ nhật] | Ngày gửi: [Chưa gửi]</w:t>
       </w:r>
     </w:p>
     <w:p>
       <w:r>
-        <w:rPr>
-          <w:i/>
-          <w:sz w:val="20"/>
-        </w:rPr>
-        <w:t>Mẫu điền hằng tuần, ưu tiên 1–2 trang. Mỗi kết quả cần ghi rõ đã làm đến đâu và sản phẩm minh chứng; chưa có kết quả thì ghi “chưa thực hiện”.</w:t>
+        <w:t>BẢN NHÁP. Điền kết quả thực tế và bằng chứng trước khi gửi; các mục tiêu dự kiến không phải kết quả đã đạt.</w:t>
       </w:r>
     </w:p>
     <w:p>
@@ -39,59 +35,36 @@
         <w:pStyle w:val="Heading1"/>
       </w:pPr>
       <w:r>
-        <w:t>1. TIẾN ĐỘ CÔNG VIỆC TUẦN NÀY</w:t>
+        <w:t>1. Tiến độ và kết quả tuần này</w:t>
       </w:r>
     </w:p>
     <w:tbl>
       <w:tblPr>
-        <w:tblStyle w:val="TableGrid"/>
+        <w:tblStyle w:val="LightShading-Accent1"/>
         <w:tblW w:type="auto" w:w="0"/>
-        <w:tblLayout w:type="fixed"/>
         <w:tblLook w:firstColumn="1" w:firstRow="1" w:lastColumn="0" w:lastRow="0" w:noHBand="0" w:noVBand="1" w:val="04A0"/>
       </w:tblPr>
       <w:tblGrid>
-        <w:gridCol w:w="510"/>
-        <w:gridCol w:w="2154"/>
-        <w:gridCol w:w="4649"/>
-        <w:gridCol w:w="2551"/>
+        <w:gridCol w:w="3289"/>
+        <w:gridCol w:w="3289"/>
+        <w:gridCol w:w="3289"/>
       </w:tblGrid>
       <w:tr>
         <w:trPr>
+          <w:cantSplit/>
           <w:tblHeader/>
         </w:trPr>
         <w:tc>
           <w:tcPr>
-            <w:tcW w:type="dxa" w:w="510"/>
-            <w:shd w:fill="17365D"/>
+            <w:tcW w:type="dxa" w:w="3289"/>
           </w:tcPr>
           <w:p>
             <w:pPr>
-              <w:spacing w:after="60" w:before="60"/>
+              <w:spacing w:after="80"/>
             </w:pPr>
             <w:r>
               <w:rPr>
-                <w:b/>
-                <w:color w:val="FFFFFF"/>
-                <w:sz w:val="21"/>
-              </w:rPr>
-              <w:t>STT</w:t>
-            </w:r>
-          </w:p>
-        </w:tc>
-        <w:tc>
-          <w:tcPr>
-            <w:tcW w:type="dxa" w:w="2154"/>
-            <w:shd w:fill="17365D"/>
-          </w:tcPr>
-          <w:p>
-            <w:pPr>
-              <w:spacing w:after="60" w:before="60"/>
-            </w:pPr>
-            <w:r>
-              <w:rPr>
-                <w:b/>
-                <w:color w:val="FFFFFF"/>
-                <w:sz w:val="21"/>
+                <w:sz w:val="20"/>
               </w:rPr>
               <w:t>Công việc</w:t>
             </w:r>
@@ -99,37 +72,31 @@
         </w:tc>
         <w:tc>
           <w:tcPr>
-            <w:tcW w:type="dxa" w:w="4649"/>
-            <w:shd w:fill="17365D"/>
+            <w:tcW w:type="dxa" w:w="3289"/>
           </w:tcPr>
           <w:p>
             <w:pPr>
-              <w:spacing w:after="60" w:before="60"/>
+              <w:spacing w:after="80"/>
             </w:pPr>
             <w:r>
               <w:rPr>
-                <w:b/>
-                <w:color w:val="FFFFFF"/>
-                <w:sz w:val="21"/>
+                <w:sz w:val="20"/>
               </w:rPr>
-              <w:t>Tiến độ và kết quả thực tế</w:t>
+              <w:t>Kết quả thực tế / phần còn lại</w:t>
             </w:r>
           </w:p>
         </w:tc>
         <w:tc>
           <w:tcPr>
-            <w:tcW w:type="dxa" w:w="2551"/>
-            <w:shd w:fill="17365D"/>
+            <w:tcW w:type="dxa" w:w="3289"/>
           </w:tcPr>
           <w:p>
             <w:pPr>
-              <w:spacing w:after="60" w:before="60"/>
+              <w:spacing w:after="80"/>
             </w:pPr>
             <w:r>
               <w:rPr>
-                <w:b/>
-                <w:color w:val="FFFFFF"/>
-                <w:sz w:val="21"/>
+                <w:sz w:val="20"/>
               </w:rPr>
               <w:t>Minh chứng</w:t>
             </w:r>
@@ -142,65 +109,106 @@
         </w:trPr>
         <w:tc>
           <w:tcPr>
-            <w:tcW w:type="dxa" w:w="510"/>
+            <w:tcW w:type="dxa" w:w="3289"/>
           </w:tcPr>
           <w:p>
             <w:pPr>
-              <w:spacing w:after="60" w:before="60"/>
+              <w:spacing w:after="80"/>
             </w:pPr>
             <w:r>
               <w:rPr>
-                <w:sz w:val="21"/>
+                <w:sz w:val="20"/>
               </w:rPr>
-              <w:t>1</w:t>
+              <w:t>[Mã việc / khối]</w:t>
             </w:r>
           </w:p>
         </w:tc>
         <w:tc>
           <w:tcPr>
-            <w:tcW w:type="dxa" w:w="2154"/>
+            <w:tcW w:type="dxa" w:w="3289"/>
           </w:tcPr>
           <w:p>
             <w:pPr>
-              <w:spacing w:after="60" w:before="60"/>
+              <w:spacing w:after="80"/>
             </w:pPr>
             <w:r>
               <w:rPr>
-                <w:sz w:val="21"/>
+                <w:sz w:val="20"/>
               </w:rPr>
-              <w:t>[Công việc / mã trong tracker]</w:t>
+              <w:t>[Đã làm gì, đến đâu; còn gì]</w:t>
             </w:r>
           </w:p>
         </w:tc>
         <w:tc>
           <w:tcPr>
-            <w:tcW w:type="dxa" w:w="4649"/>
+            <w:tcW w:type="dxa" w:w="3289"/>
           </w:tcPr>
           <w:p>
             <w:pPr>
-              <w:spacing w:after="60" w:before="60"/>
+              <w:spacing w:after="80"/>
             </w:pPr>
             <w:r>
               <w:rPr>
-                <w:sz w:val="21"/>
+                <w:sz w:val="20"/>
               </w:rPr>
-              <w:t>[Kết quả đã làm; trạng thái và phần còn lại]</w:t>
+              <w:t>[File/ảnh/trace]</w:t>
+            </w:r>
+          </w:p>
+        </w:tc>
+      </w:tr>
+    </w:tbl>
+    <w:p>
+      <w:pPr>
+        <w:pStyle w:val="Heading1"/>
+      </w:pPr>
+      <w:r>
+        <w:t>2. Khó khăn, vấn đề và giải pháp</w:t>
+      </w:r>
+    </w:p>
+    <w:tbl>
+      <w:tblPr>
+        <w:tblStyle w:val="LightShading-Accent1"/>
+        <w:tblW w:type="auto" w:w="0"/>
+        <w:tblLook w:firstColumn="1" w:firstRow="1" w:lastColumn="0" w:lastRow="0" w:noHBand="0" w:noVBand="1" w:val="04A0"/>
+      </w:tblPr>
+      <w:tblGrid>
+        <w:gridCol w:w="4933"/>
+        <w:gridCol w:w="4933"/>
+      </w:tblGrid>
+      <w:tr>
+        <w:trPr>
+          <w:cantSplit/>
+          <w:tblHeader/>
+        </w:trPr>
+        <w:tc>
+          <w:tcPr>
+            <w:tcW w:type="dxa" w:w="4933"/>
+          </w:tcPr>
+          <w:p>
+            <w:pPr>
+              <w:spacing w:after="80"/>
+            </w:pPr>
+            <w:r>
+              <w:rPr>
+                <w:sz w:val="20"/>
+              </w:rPr>
+              <w:t>Vấn đề / ảnh hưởng</w:t>
             </w:r>
           </w:p>
         </w:tc>
         <w:tc>
           <w:tcPr>
-            <w:tcW w:type="dxa" w:w="2551"/>
+            <w:tcW w:type="dxa" w:w="4933"/>
           </w:tcPr>
           <w:p>
             <w:pPr>
-              <w:spacing w:after="60" w:before="60"/>
+              <w:spacing w:after="80"/>
             </w:pPr>
             <w:r>
               <w:rPr>
-                <w:sz w:val="21"/>
+                <w:sz w:val="20"/>
               </w:rPr>
-              <w:t>[Tệp, hình, sơ đồ hoặc liên kết]</w:t>
+              <w:t>Giải pháp và kết quả xử lý</w:t>
             </w:r>
           </w:p>
         </w:tc>
@@ -211,134 +219,33 @@
         </w:trPr>
         <w:tc>
           <w:tcPr>
-            <w:tcW w:type="dxa" w:w="510"/>
+            <w:tcW w:type="dxa" w:w="4933"/>
           </w:tcPr>
           <w:p>
             <w:pPr>
-              <w:spacing w:after="60" w:before="60"/>
+              <w:spacing w:after="80"/>
             </w:pPr>
             <w:r>
               <w:rPr>
-                <w:sz w:val="21"/>
+                <w:sz w:val="20"/>
               </w:rPr>
-              <w:t>2</w:t>
+              <w:t>[Vấn đề quan sát được]</w:t>
             </w:r>
           </w:p>
         </w:tc>
         <w:tc>
           <w:tcPr>
-            <w:tcW w:type="dxa" w:w="2154"/>
+            <w:tcW w:type="dxa" w:w="4933"/>
           </w:tcPr>
           <w:p>
             <w:pPr>
-              <w:spacing w:after="60" w:before="60"/>
+              <w:spacing w:after="80"/>
             </w:pPr>
             <w:r>
               <w:rPr>
-                <w:sz w:val="21"/>
+                <w:sz w:val="20"/>
               </w:rPr>
-              <w:t>[Công việc / nội dung học]</w:t>
-            </w:r>
-          </w:p>
-        </w:tc>
-        <w:tc>
-          <w:tcPr>
-            <w:tcW w:type="dxa" w:w="4649"/>
-          </w:tcPr>
-          <w:p>
-            <w:pPr>
-              <w:spacing w:after="60" w:before="60"/>
-            </w:pPr>
-            <w:r>
-              <w:rPr>
-                <w:sz w:val="21"/>
-              </w:rPr>
-              <w:t>[Kết quả thực tế; điều đã hiểu hoặc đã thực hành]</w:t>
-            </w:r>
-          </w:p>
-        </w:tc>
-        <w:tc>
-          <w:tcPr>
-            <w:tcW w:type="dxa" w:w="2551"/>
-          </w:tcPr>
-          <w:p>
-            <w:pPr>
-              <w:spacing w:after="60" w:before="60"/>
-            </w:pPr>
-            <w:r>
-              <w:rPr>
-                <w:sz w:val="21"/>
-              </w:rPr>
-              <w:t>[Minh chứng]</w:t>
-            </w:r>
-          </w:p>
-        </w:tc>
-      </w:tr>
-      <w:tr>
-        <w:trPr>
-          <w:cantSplit/>
-        </w:trPr>
-        <w:tc>
-          <w:tcPr>
-            <w:tcW w:type="dxa" w:w="510"/>
-          </w:tcPr>
-          <w:p>
-            <w:pPr>
-              <w:spacing w:after="60" w:before="60"/>
-            </w:pPr>
-            <w:r>
-              <w:rPr>
-                <w:sz w:val="21"/>
-              </w:rPr>
-              <w:t>3</w:t>
-            </w:r>
-          </w:p>
-        </w:tc>
-        <w:tc>
-          <w:tcPr>
-            <w:tcW w:type="dxa" w:w="2154"/>
-          </w:tcPr>
-          <w:p>
-            <w:pPr>
-              <w:spacing w:after="60" w:before="60"/>
-            </w:pPr>
-            <w:r>
-              <w:rPr>
-                <w:sz w:val="21"/>
-              </w:rPr>
-              <w:t>[Công việc khác nếu có]</w:t>
-            </w:r>
-          </w:p>
-        </w:tc>
-        <w:tc>
-          <w:tcPr>
-            <w:tcW w:type="dxa" w:w="4649"/>
-          </w:tcPr>
-          <w:p>
-            <w:pPr>
-              <w:spacing w:after="60" w:before="60"/>
-            </w:pPr>
-            <w:r>
-              <w:rPr>
-                <w:sz w:val="21"/>
-              </w:rPr>
-              <w:t>[Kết quả thực tế]</w:t>
-            </w:r>
-          </w:p>
-        </w:tc>
-        <w:tc>
-          <w:tcPr>
-            <w:tcW w:type="dxa" w:w="2551"/>
-          </w:tcPr>
-          <w:p>
-            <w:pPr>
-              <w:spacing w:after="60" w:before="60"/>
-            </w:pPr>
-            <w:r>
-              <w:rPr>
-                <w:sz w:val="21"/>
-              </w:rPr>
-              <w:t>[Minh chứng]</w:t>
+              <w:t>[Nguyên nhân dự kiến; đã thử gì; kết quả; bước tiếp]</w:t>
             </w:r>
           </w:p>
         </w:tc>
@@ -346,242 +253,52 @@
     </w:tbl>
     <w:p>
       <w:pPr>
-        <w:spacing w:after="0"/>
+        <w:pStyle w:val="Heading1"/>
       </w:pPr>
+      <w:r>
+        <w:t>3. Ý nghĩa thiết kế và kiến thức rút ra</w:t>
+      </w:r>
+    </w:p>
+    <w:p>
+      <w:r>
+        <w:t>[Từ một kết quả thật, giải thích: chọn cấu trúc gì → giải quyết vấn đề nào → đánh đổi gì → liên hệ đồ án/luận văn.]</w:t>
+      </w:r>
     </w:p>
     <w:p>
       <w:pPr>
         <w:pStyle w:val="Heading1"/>
       </w:pPr>
       <w:r>
-        <w:t>2. KHÓ KHĂN GẶP PHẢI VÀ CÁCH GIẢI QUYẾT</w:t>
+        <w:t>4. Kế hoạch tuần tới</w:t>
       </w:r>
     </w:p>
     <w:tbl>
       <w:tblPr>
-        <w:tblStyle w:val="TableGrid"/>
+        <w:tblStyle w:val="LightShading-Accent1"/>
         <w:tblW w:type="auto" w:w="0"/>
-        <w:tblLayout w:type="fixed"/>
         <w:tblLook w:firstColumn="1" w:firstRow="1" w:lastColumn="0" w:lastRow="0" w:noHBand="0" w:noVBand="1" w:val="04A0"/>
       </w:tblPr>
       <w:tblGrid>
-        <w:gridCol w:w="2324"/>
-        <w:gridCol w:w="2891"/>
-        <w:gridCol w:w="4649"/>
+        <w:gridCol w:w="3289"/>
+        <w:gridCol w:w="3289"/>
+        <w:gridCol w:w="3289"/>
       </w:tblGrid>
       <w:tr>
         <w:trPr>
+          <w:cantSplit/>
           <w:tblHeader/>
         </w:trPr>
         <w:tc>
           <w:tcPr>
-            <w:tcW w:type="dxa" w:w="2324"/>
-            <w:shd w:fill="17365D"/>
+            <w:tcW w:type="dxa" w:w="3289"/>
           </w:tcPr>
           <w:p>
             <w:pPr>
-              <w:spacing w:after="60" w:before="60"/>
+              <w:spacing w:after="80"/>
             </w:pPr>
             <w:r>
               <w:rPr>
-                <w:b/>
-                <w:color w:val="FFFFFF"/>
-                <w:sz w:val="21"/>
-              </w:rPr>
-              <w:t>Khó khăn</w:t>
-            </w:r>
-          </w:p>
-        </w:tc>
-        <w:tc>
-          <w:tcPr>
-            <w:tcW w:type="dxa" w:w="2891"/>
-            <w:shd w:fill="17365D"/>
-          </w:tcPr>
-          <w:p>
-            <w:pPr>
-              <w:spacing w:after="60" w:before="60"/>
-            </w:pPr>
-            <w:r>
-              <w:rPr>
-                <w:b/>
-                <w:color w:val="FFFFFF"/>
-                <w:sz w:val="21"/>
-              </w:rPr>
-              <w:t>Ảnh hưởng</w:t>
-            </w:r>
-          </w:p>
-        </w:tc>
-        <w:tc>
-          <w:tcPr>
-            <w:tcW w:type="dxa" w:w="4649"/>
-            <w:shd w:fill="17365D"/>
-          </w:tcPr>
-          <w:p>
-            <w:pPr>
-              <w:spacing w:after="60" w:before="60"/>
-            </w:pPr>
-            <w:r>
-              <w:rPr>
-                <w:b/>
-                <w:color w:val="FFFFFF"/>
-                <w:sz w:val="21"/>
-              </w:rPr>
-              <w:t>Cách giải quyết / hỗ trợ cần thiết</w:t>
-            </w:r>
-          </w:p>
-        </w:tc>
-      </w:tr>
-      <w:tr>
-        <w:trPr>
-          <w:cantSplit/>
-        </w:trPr>
-        <w:tc>
-          <w:tcPr>
-            <w:tcW w:type="dxa" w:w="2324"/>
-          </w:tcPr>
-          <w:p>
-            <w:pPr>
-              <w:spacing w:after="60" w:before="60"/>
-            </w:pPr>
-            <w:r>
-              <w:rPr>
-                <w:sz w:val="21"/>
-              </w:rPr>
-              <w:t>[Khó khăn cụ thể]</w:t>
-            </w:r>
-          </w:p>
-        </w:tc>
-        <w:tc>
-          <w:tcPr>
-            <w:tcW w:type="dxa" w:w="2891"/>
-          </w:tcPr>
-          <w:p>
-            <w:pPr>
-              <w:spacing w:after="60" w:before="60"/>
-            </w:pPr>
-            <w:r>
-              <w:rPr>
-                <w:sz w:val="21"/>
-              </w:rPr>
-              <w:t>[Ảnh hưởng đến tiến độ/kết quả]</w:t>
-            </w:r>
-          </w:p>
-        </w:tc>
-        <w:tc>
-          <w:tcPr>
-            <w:tcW w:type="dxa" w:w="4649"/>
-          </w:tcPr>
-          <w:p>
-            <w:pPr>
-              <w:spacing w:after="60" w:before="60"/>
-            </w:pPr>
-            <w:r>
-              <w:rPr>
-                <w:sz w:val="21"/>
-              </w:rPr>
-              <w:t>[Đã thử gì, kết quả; phương án tiếp theo; hỗ trợ cần từ thầy]</w:t>
-            </w:r>
-          </w:p>
-        </w:tc>
-      </w:tr>
-      <w:tr>
-        <w:trPr>
-          <w:cantSplit/>
-        </w:trPr>
-        <w:tc>
-          <w:tcPr>
-            <w:tcW w:type="dxa" w:w="2324"/>
-          </w:tcPr>
-          <w:p>
-            <w:pPr>
-              <w:spacing w:after="60" w:before="60"/>
-            </w:pPr>
-            <w:r>
-              <w:rPr>
-                <w:sz w:val="21"/>
-              </w:rPr>
-              <w:t>[Khó khăn khác hoặc “không có”]</w:t>
-            </w:r>
-          </w:p>
-        </w:tc>
-        <w:tc>
-          <w:tcPr>
-            <w:tcW w:type="dxa" w:w="2891"/>
-          </w:tcPr>
-          <w:p>
-            <w:pPr>
-              <w:spacing w:after="60" w:before="60"/>
-            </w:pPr>
-            <w:r>
-              <w:rPr>
-                <w:sz w:val="21"/>
-              </w:rPr>
-              <w:t>[Ảnh hưởng]</w:t>
-            </w:r>
-          </w:p>
-        </w:tc>
-        <w:tc>
-          <w:tcPr>
-            <w:tcW w:type="dxa" w:w="4649"/>
-          </w:tcPr>
-          <w:p>
-            <w:pPr>
-              <w:spacing w:after="60" w:before="60"/>
-            </w:pPr>
-            <w:r>
-              <w:rPr>
-                <w:sz w:val="21"/>
-              </w:rPr>
-              <w:t>[Cách xử lý và thời hạn dự kiến]</w:t>
-            </w:r>
-          </w:p>
-        </w:tc>
-      </w:tr>
-    </w:tbl>
-    <w:p>
-      <w:pPr>
-        <w:spacing w:after="0"/>
-      </w:pPr>
-    </w:p>
-    <w:p>
-      <w:pPr>
-        <w:pStyle w:val="Heading1"/>
-      </w:pPr>
-      <w:r>
-        <w:t>3. NHIỆM VỤ TUẦN TỚI</w:t>
-      </w:r>
-    </w:p>
-    <w:tbl>
-      <w:tblPr>
-        <w:tblStyle w:val="TableGrid"/>
-        <w:tblW w:type="auto" w:w="0"/>
-        <w:tblLayout w:type="fixed"/>
-        <w:tblLook w:firstColumn="1" w:firstRow="1" w:lastColumn="0" w:lastRow="0" w:noHBand="0" w:noVBand="1" w:val="04A0"/>
-      </w:tblPr>
-      <w:tblGrid>
-        <w:gridCol w:w="624"/>
-        <w:gridCol w:w="3458"/>
-        <w:gridCol w:w="4422"/>
-        <w:gridCol w:w="1361"/>
-      </w:tblGrid>
-      <w:tr>
-        <w:trPr>
-          <w:tblHeader/>
-        </w:trPr>
-        <w:tc>
-          <w:tcPr>
-            <w:tcW w:type="dxa" w:w="624"/>
-            <w:shd w:fill="17365D"/>
-          </w:tcPr>
-          <w:p>
-            <w:pPr>
-              <w:spacing w:after="60" w:before="60"/>
-            </w:pPr>
-            <w:r>
-              <w:rPr>
-                <w:b/>
-                <w:color w:val="FFFFFF"/>
-                <w:sz w:val="21"/>
+                <w:sz w:val="20"/>
               </w:rPr>
               <w:t>Ưu tiên</w:t>
             </w:r>
@@ -589,56 +306,31 @@
         </w:tc>
         <w:tc>
           <w:tcPr>
-            <w:tcW w:type="dxa" w:w="3458"/>
-            <w:shd w:fill="17365D"/>
+            <w:tcW w:type="dxa" w:w="3289"/>
           </w:tcPr>
           <w:p>
             <w:pPr>
-              <w:spacing w:after="60" w:before="60"/>
+              <w:spacing w:after="80"/>
             </w:pPr>
             <w:r>
               <w:rPr>
-                <w:b/>
-                <w:color w:val="FFFFFF"/>
-                <w:sz w:val="21"/>
+                <w:sz w:val="20"/>
               </w:rPr>
-              <w:t>Nhiệm vụ</w:t>
+              <w:t>Nhiệm vụ / đầu ra</w:t>
             </w:r>
           </w:p>
         </w:tc>
         <w:tc>
           <w:tcPr>
-            <w:tcW w:type="dxa" w:w="4422"/>
-            <w:shd w:fill="17365D"/>
+            <w:tcW w:type="dxa" w:w="3289"/>
           </w:tcPr>
           <w:p>
             <w:pPr>
-              <w:spacing w:after="60" w:before="60"/>
+              <w:spacing w:after="80"/>
             </w:pPr>
             <w:r>
               <w:rPr>
-                <w:b/>
-                <w:color w:val="FFFFFF"/>
-                <w:sz w:val="21"/>
-              </w:rPr>
-              <w:t>Kết quả cần đạt</w:t>
-            </w:r>
-          </w:p>
-        </w:tc>
-        <w:tc>
-          <w:tcPr>
-            <w:tcW w:type="dxa" w:w="1361"/>
-            <w:shd w:fill="17365D"/>
-          </w:tcPr>
-          <w:p>
-            <w:pPr>
-              <w:spacing w:after="60" w:before="60"/>
-            </w:pPr>
-            <w:r>
-              <w:rPr>
-                <w:b/>
-                <w:color w:val="FFFFFF"/>
-                <w:sz w:val="21"/>
+                <w:sz w:val="20"/>
               </w:rPr>
               <w:t>Thời hạn</w:t>
             </w:r>
@@ -651,15 +343,15 @@
         </w:trPr>
         <w:tc>
           <w:tcPr>
-            <w:tcW w:type="dxa" w:w="624"/>
+            <w:tcW w:type="dxa" w:w="3289"/>
           </w:tcPr>
           <w:p>
             <w:pPr>
-              <w:spacing w:after="60" w:before="60"/>
+              <w:spacing w:after="80"/>
             </w:pPr>
             <w:r>
               <w:rPr>
-                <w:sz w:val="21"/>
+                <w:sz w:val="20"/>
               </w:rPr>
               <w:t>1</w:t>
             </w:r>
@@ -667,49 +359,33 @@
         </w:tc>
         <w:tc>
           <w:tcPr>
-            <w:tcW w:type="dxa" w:w="3458"/>
+            <w:tcW w:type="dxa" w:w="3289"/>
           </w:tcPr>
           <w:p>
             <w:pPr>
-              <w:spacing w:after="60" w:before="60"/>
+              <w:spacing w:after="80"/>
             </w:pPr>
             <w:r>
               <w:rPr>
-                <w:sz w:val="21"/>
+                <w:sz w:val="20"/>
               </w:rPr>
-              <w:t>[Nhiệm vụ ưu tiên nhất]</w:t>
+              <w:t>[Việc tồn đọng + sản phẩm có thể kiểm tra]</w:t>
             </w:r>
           </w:p>
         </w:tc>
         <w:tc>
           <w:tcPr>
-            <w:tcW w:type="dxa" w:w="4422"/>
+            <w:tcW w:type="dxa" w:w="3289"/>
           </w:tcPr>
           <w:p>
             <w:pPr>
-              <w:spacing w:after="60" w:before="60"/>
+              <w:spacing w:after="80"/>
             </w:pPr>
             <w:r>
               <w:rPr>
-                <w:sz w:val="21"/>
+                <w:sz w:val="20"/>
               </w:rPr>
-              <w:t>[Sản phẩm/kết quả mong đợi]</w:t>
-            </w:r>
-          </w:p>
-        </w:tc>
-        <w:tc>
-          <w:tcPr>
-            <w:tcW w:type="dxa" w:w="1361"/>
-          </w:tcPr>
-          <w:p>
-            <w:pPr>
-              <w:spacing w:after="60" w:before="60"/>
-            </w:pPr>
-            <w:r>
-              <w:rPr>
-                <w:sz w:val="21"/>
-              </w:rPr>
-              <w:t>[Ngày dự kiến]</w:t>
+              <w:t>[Ngày]</w:t>
             </w:r>
           </w:p>
         </w:tc>
@@ -720,15 +396,15 @@
         </w:trPr>
         <w:tc>
           <w:tcPr>
-            <w:tcW w:type="dxa" w:w="624"/>
+            <w:tcW w:type="dxa" w:w="3289"/>
           </w:tcPr>
           <w:p>
             <w:pPr>
-              <w:spacing w:after="60" w:before="60"/>
+              <w:spacing w:after="80"/>
             </w:pPr>
             <w:r>
               <w:rPr>
-                <w:sz w:val="21"/>
+                <w:sz w:val="20"/>
               </w:rPr>
               <w:t>2</w:t>
             </w:r>
@@ -736,143 +412,52 @@
         </w:tc>
         <w:tc>
           <w:tcPr>
-            <w:tcW w:type="dxa" w:w="3458"/>
+            <w:tcW w:type="dxa" w:w="3289"/>
           </w:tcPr>
           <w:p>
             <w:pPr>
-              <w:spacing w:after="60" w:before="60"/>
+              <w:spacing w:after="80"/>
             </w:pPr>
             <w:r>
               <w:rPr>
-                <w:sz w:val="21"/>
+                <w:sz w:val="20"/>
               </w:rPr>
-              <w:t>[Nhiệm vụ tiếp theo]</w:t>
+              <w:t>[Việc mới + điều kiện bắt đầu]</w:t>
             </w:r>
           </w:p>
         </w:tc>
         <w:tc>
           <w:tcPr>
-            <w:tcW w:type="dxa" w:w="4422"/>
+            <w:tcW w:type="dxa" w:w="3289"/>
           </w:tcPr>
           <w:p>
             <w:pPr>
-              <w:spacing w:after="60" w:before="60"/>
+              <w:spacing w:after="80"/>
             </w:pPr>
             <w:r>
               <w:rPr>
-                <w:sz w:val="21"/>
+                <w:sz w:val="20"/>
               </w:rPr>
-              <w:t>[Đầu ra cụ thể]</w:t>
-            </w:r>
-          </w:p>
-        </w:tc>
-        <w:tc>
-          <w:tcPr>
-            <w:tcW w:type="dxa" w:w="1361"/>
-          </w:tcPr>
-          <w:p>
-            <w:pPr>
-              <w:spacing w:after="60" w:before="60"/>
-            </w:pPr>
-            <w:r>
-              <w:rPr>
-                <w:sz w:val="21"/>
-              </w:rPr>
-              <w:t>[Ngày dự kiến]</w:t>
-            </w:r>
-          </w:p>
-        </w:tc>
-      </w:tr>
-      <w:tr>
-        <w:trPr>
-          <w:cantSplit/>
-        </w:trPr>
-        <w:tc>
-          <w:tcPr>
-            <w:tcW w:type="dxa" w:w="624"/>
-          </w:tcPr>
-          <w:p>
-            <w:pPr>
-              <w:spacing w:after="60" w:before="60"/>
-            </w:pPr>
-            <w:r>
-              <w:rPr>
-                <w:sz w:val="21"/>
-              </w:rPr>
-              <w:t>3</w:t>
-            </w:r>
-          </w:p>
-        </w:tc>
-        <w:tc>
-          <w:tcPr>
-            <w:tcW w:type="dxa" w:w="3458"/>
-          </w:tcPr>
-          <w:p>
-            <w:pPr>
-              <w:spacing w:after="60" w:before="60"/>
-            </w:pPr>
-            <w:r>
-              <w:rPr>
-                <w:sz w:val="21"/>
-              </w:rPr>
-              <w:t>[Nhiệm vụ nếu đủ thời gian]</w:t>
-            </w:r>
-          </w:p>
-        </w:tc>
-        <w:tc>
-          <w:tcPr>
-            <w:tcW w:type="dxa" w:w="4422"/>
-          </w:tcPr>
-          <w:p>
-            <w:pPr>
-              <w:spacing w:after="60" w:before="60"/>
-            </w:pPr>
-            <w:r>
-              <w:rPr>
-                <w:sz w:val="21"/>
-              </w:rPr>
-              <w:t>[Đầu ra cụ thể]</w:t>
-            </w:r>
-          </w:p>
-        </w:tc>
-        <w:tc>
-          <w:tcPr>
-            <w:tcW w:type="dxa" w:w="1361"/>
-          </w:tcPr>
-          <w:p>
-            <w:pPr>
-              <w:spacing w:after="60" w:before="60"/>
-            </w:pPr>
-            <w:r>
-              <w:rPr>
-                <w:sz w:val="21"/>
-              </w:rPr>
-              <w:t>[Ngày dự kiến]</w:t>
+              <w:t>[Ngày]</w:t>
             </w:r>
           </w:p>
         </w:tc>
       </w:tr>
     </w:tbl>
     <w:p>
-      <w:pPr>
-        <w:spacing w:after="0"/>
-      </w:pPr>
-    </w:p>
-    <w:p>
       <w:r>
-        <w:t>Nội dung xin ý kiến thầy: [1–2 câu hỏi hoặc quyết định cần trao đổi.]</w:t>
+        <w:t>Xin ý kiến GVHD: [Xác nhận mức ưu tiên BTL trong tuần và lịch demo/báo cáo; ghi câu hỏi cụ thể sau thực hành.]</w:t>
       </w:r>
     </w:p>
     <w:p>
       <w:r>
-        <w:t>Góp ý của thầy / việc cần làm sau buổi trao đổi: [Điền sau khi báo cáo.]</w:t>
+        <w:t>Ngày gửi thực tế: [Chưa gửi] | Góp ý của thầy: [Chưa có] | Việc điều chỉnh sau góp ý: [Chưa có]</w:t>
       </w:r>
     </w:p>
     <w:sectPr>
-      <w:headerReference w:type="default" r:id="rId9"/>
-      <w:footerReference w:type="default" r:id="rId10"/>
+      <w:footerReference w:type="default" r:id="rId9"/>
       <w:pgSz w:w="11906" w:h="16838"/>
-      <w:pgMar w:top="907" w:right="1020" w:bottom="850" w:left="1020" w:header="720" w:footer="720" w:gutter="0"/>
+      <w:pgMar w:top="964" w:right="1020" w:bottom="907" w:left="1020" w:header="720" w:footer="720" w:gutter="0"/>
       <w:cols w:space="720"/>
       <w:docGrid w:linePitch="360"/>
     </w:sectPr>
@@ -887,32 +472,11 @@
       <w:pStyle w:val="Footer"/>
     </w:pPr>
     <w:r>
-      <w:rPr>
-        <w:color w:val="657184"/>
-        <w:sz w:val="18"/>
-      </w:rPr>
-      <w:t xml:space="preserve">Nguyễn Hải Minh  |  Báo cáo tiến độ luận văn  |  </w:t>
+      <w:t xml:space="preserve">Nguyễn Hải Minh • Kiến trúc máy tính / RISC-V     |     </w:t>
     </w:r>
     <w:fldSimple w:instr="PAGE"/>
   </w:p>
 </w:ftr>
-</file>
-
-<file path=word/header1.xml><?xml version="1.0" encoding="utf-8"?>
-<w:hdr xmlns:m="http://schemas.openxmlformats.org/officeDocument/2006/math" xmlns:mc="http://schemas.openxmlformats.org/markup-compatibility/2006" xmlns:mo="http://schemas.microsoft.com/office/mac/office/2008/main" xmlns:mv="urn:schemas-microsoft-com:mac:vml" xmlns:o="urn:schemas-microsoft-com:office:office" xmlns:r="http://schemas.openxmlformats.org/officeDocument/2006/relationships" xmlns:v="urn:schemas-microsoft-com:vml" xmlns:w10="urn:schemas-microsoft-com:office:word" xmlns:w14="http://schemas.microsoft.com/office/word/2010/wordml" xmlns:w="http://schemas.openxmlformats.org/wordprocessingml/2006/main" xmlns:wne="http://schemas.microsoft.com/office/word/2006/wordml" xmlns:wp14="http://schemas.microsoft.com/office/word/2010/wordprocessingDrawing" xmlns:wp="http://schemas.openxmlformats.org/drawingml/2006/wordprocessingDrawing" xmlns:wpc="http://schemas.microsoft.com/office/word/2010/wordprocessingCanvas" xmlns:wpg="http://schemas.microsoft.com/office/word/2010/wordprocessingGroup" xmlns:wpi="http://schemas.microsoft.com/office/word/2010/wordprocessingInk" xmlns:wps="http://schemas.microsoft.com/office/word/2010/wordprocessingShape" mc:Ignorable="w14 wp14">
-  <w:p>
-    <w:pPr>
-      <w:pStyle w:val="Header"/>
-    </w:pPr>
-    <w:r>
-      <w:rPr>
-        <w:color w:val="657184"/>
-        <w:sz w:val="18"/>
-      </w:rPr>
-      <w:t>LUẬN VĂN THẠC SĨ  |  KỸ THUẬT MÁY TÍNH</w:t>
-    </w:r>
-  </w:p>
-</w:hdr>
 </file>
 
 <file path=word/numbering.xml><?xml version="1.0" encoding="utf-8"?>
@@ -1279,10 +843,10 @@
     <w:qFormat/>
     <w:rsid w:val="00FC693F"/>
     <w:pPr>
-      <w:spacing w:after="100" w:line="252" w:lineRule="auto"/>
+      <w:spacing w:after="120"/>
     </w:pPr>
     <w:rPr>
-      <w:rFonts w:ascii="Times New Roman" w:hAnsi="Times New Roman"/>
+      <w:rFonts w:ascii="Calibri" w:hAnsi="Calibri"/>
       <w:sz w:val="22"/>
     </w:rPr>
   </w:style>
@@ -1345,11 +909,11 @@
       <w:outlineLvl w:val="0"/>
     </w:pPr>
     <w:rPr>
-      <w:rFonts w:asciiTheme="majorHAnsi" w:eastAsiaTheme="majorEastAsia" w:hAnsiTheme="majorHAnsi" w:cstheme="majorBidi" w:ascii="Times New Roman" w:hAnsi="Times New Roman"/>
+      <w:rFonts w:asciiTheme="majorHAnsi" w:eastAsiaTheme="majorEastAsia" w:hAnsiTheme="majorHAnsi" w:cstheme="majorBidi" w:ascii="Calibri" w:hAnsi="Calibri"/>
       <w:b/>
       <w:bCs/>
       <w:color w:val="17365D"/>
-      <w:sz w:val="24"/>
+      <w:sz w:val="28"/>
       <w:szCs w:val="28"/>
     </w:rPr>
   </w:style>
@@ -1369,7 +933,7 @@
       <w:outlineLvl w:val="1"/>
     </w:pPr>
     <w:rPr>
-      <w:rFonts w:asciiTheme="majorHAnsi" w:eastAsiaTheme="majorEastAsia" w:hAnsiTheme="majorHAnsi" w:cstheme="majorBidi" w:ascii="Times New Roman" w:hAnsi="Times New Roman"/>
+      <w:rFonts w:asciiTheme="majorHAnsi" w:eastAsiaTheme="majorEastAsia" w:hAnsiTheme="majorHAnsi" w:cstheme="majorBidi" w:ascii="Calibri" w:hAnsi="Calibri"/>
       <w:b/>
       <w:bCs/>
       <w:color w:val="17365D"/>
@@ -1634,11 +1198,11 @@
       <w:contextualSpacing/>
     </w:pPr>
     <w:rPr>
-      <w:rFonts w:asciiTheme="majorHAnsi" w:eastAsiaTheme="majorEastAsia" w:hAnsiTheme="majorHAnsi" w:cstheme="majorBidi" w:ascii="Times New Roman" w:hAnsi="Times New Roman"/>
+      <w:rFonts w:asciiTheme="majorHAnsi" w:eastAsiaTheme="majorEastAsia" w:hAnsiTheme="majorHAnsi" w:cstheme="majorBidi" w:ascii="Calibri" w:hAnsi="Calibri"/>
       <w:color w:val="17365D"/>
       <w:spacing w:val="5"/>
       <w:kern w:val="28"/>
-      <w:sz w:val="34"/>
+      <w:sz w:val="52"/>
       <w:szCs w:val="52"/>
     </w:rPr>
   </w:style>

</xml_diff>